<commit_message>
Este si es el informe final
</commit_message>
<xml_diff>
--- a/docs/Informe AURA AZURE.docx
+++ b/docs/Informe AURA AZURE.docx
@@ -188,7 +188,7 @@
     </w:p>
     <w:p>
       <w:pPr>
-        <w:pStyle w:val="Ttulo1"/>
+        <w:pStyle w:val="Heading1"/>
         <w:rPr>
           <w:lang w:val="es-CL"/>
         </w:rPr>
@@ -231,7 +231,7 @@
     </w:p>
     <w:p>
       <w:pPr>
-        <w:pStyle w:val="Ttulo1"/>
+        <w:pStyle w:val="Heading1"/>
         <w:rPr>
           <w:lang w:val="es-CL"/>
         </w:rPr>
@@ -400,7 +400,7 @@
     </w:p>
     <w:p>
       <w:pPr>
-        <w:pStyle w:val="Ttulo1"/>
+        <w:pStyle w:val="Heading1"/>
         <w:rPr>
           <w:lang w:val="es-CL"/>
         </w:rPr>
@@ -541,7 +541,7 @@
     </w:p>
     <w:p>
       <w:pPr>
-        <w:pStyle w:val="Ttulo1"/>
+        <w:pStyle w:val="Heading1"/>
         <w:rPr>
           <w:lang w:val="es-CL"/>
         </w:rPr>
@@ -838,7 +838,7 @@
     </w:p>
     <w:p>
       <w:pPr>
-        <w:pStyle w:val="Ttulo1"/>
+        <w:pStyle w:val="Heading1"/>
         <w:rPr>
           <w:lang w:val="es-CL"/>
         </w:rPr>
@@ -943,7 +943,7 @@
     </w:p>
     <w:p>
       <w:pPr>
-        <w:pStyle w:val="Ttulo1"/>
+        <w:pStyle w:val="Heading1"/>
         <w:rPr>
           <w:lang w:val="es-CL"/>
         </w:rPr>
@@ -1046,12 +1046,15 @@
         <w:jc w:val="center"/>
       </w:pPr>
       <w:r>
+        <w:rPr>
+          <w:noProof/>
+        </w:rPr>
         <w:lastRenderedPageBreak/>
         <w:drawing>
-          <wp:inline distT="0" distB="0" distL="0" distR="0" wp14:anchorId="5B04280F" wp14:editId="0DDE957F">
-            <wp:extent cx="5943600" cy="3342640"/>
+          <wp:inline distT="0" distB="0" distL="0" distR="0" wp14:anchorId="1C808CB8" wp14:editId="0AA3247F">
+            <wp:extent cx="5715000" cy="2266950"/>
             <wp:effectExtent l="0" t="0" r="0" b="0"/>
-            <wp:docPr id="863642343" name="Imagen 1"/>
+            <wp:docPr id="7" name="image_7.png" descr="image_7.png" title="image_7.png"/>
             <wp:cNvGraphicFramePr>
               <a:graphicFrameLocks xmlns:a="http://schemas.openxmlformats.org/drawingml/2006/main" noChangeAspect="1"/>
             </wp:cNvGraphicFramePr>
@@ -1059,19 +1062,22 @@
               <a:graphicData uri="http://schemas.openxmlformats.org/drawingml/2006/picture">
                 <pic:pic xmlns:pic="http://schemas.openxmlformats.org/drawingml/2006/picture">
                   <pic:nvPicPr>
-                    <pic:cNvPr id="863642343" name=""/>
-                    <pic:cNvPicPr/>
+                    <pic:cNvPr id="0" name=""/>
+                    <pic:cNvPicPr>
+                      <a:picLocks noChangeAspect="1" noChangeArrowheads="1"/>
+                    </pic:cNvPicPr>
                   </pic:nvPicPr>
                   <pic:blipFill>
                     <a:blip r:embed="rId14"/>
+                    <a:srcRect/>
                     <a:stretch>
                       <a:fillRect/>
                     </a:stretch>
                   </pic:blipFill>
-                  <pic:spPr>
+                  <pic:spPr bwMode="auto">
                     <a:xfrm>
                       <a:off x="0" y="0"/>
-                      <a:ext cx="5943600" cy="3342640"/>
+                      <a:ext cx="5715000" cy="2266950"/>
                     </a:xfrm>
                     <a:prstGeom prst="rect">
                       <a:avLst/>
@@ -1089,9 +1095,7 @@
         <w:keepLines/>
         <w:spacing w:before="60" w:after="240"/>
         <w:rPr>
-          <w:sz w:val="20"/>
-          <w:szCs w:val="20"/>
-          <w:lang w:val="es-MX"/>
+          <w:lang w:val="es-CL"/>
         </w:rPr>
       </w:pPr>
       <w:r>
@@ -1100,31 +1104,53 @@
           <w:bCs/>
           <w:sz w:val="20"/>
           <w:szCs w:val="20"/>
-          <w:lang w:val="es-MX"/>
-        </w:rPr>
-        <w:t xml:space="preserve">Figura 7. Listado de espacios (READ) mediante acceso externo. La captura de pantalla completa desde un navegador externo demuestra el funcionamiento del sitio publicado a través de la URL pública de Azure (puntoalerce.chilecentral.cloudapp.azure.com), confirmando que el sistema no se ejecuta en </w:t>
-      </w:r>
-      <w:r>
-        <w:rPr>
-          <w:b/>
-          <w:bCs/>
-          <w:i/>
-          <w:iCs/>
-          <w:sz w:val="20"/>
-          <w:szCs w:val="20"/>
-          <w:lang w:val="es-MX"/>
-        </w:rPr>
-        <w:t>localhost</w:t>
-      </w:r>
-      <w:r>
-        <w:rPr>
-          <w:b/>
-          <w:bCs/>
-          <w:sz w:val="20"/>
-          <w:szCs w:val="20"/>
-          <w:lang w:val="es-MX"/>
-        </w:rPr>
-        <w:t>. En la interfaz se visualiza la tabla con los seis espacios del estacionamiento, sus estados, patentes registradas y los botones de acción para ejecutar el resto de las operaciones CRUD.</w:t>
+          <w:lang w:val="es-CL"/>
+        </w:rPr>
+        <w:t xml:space="preserve">Figura 7. Listado de espacios (READ). </w:t>
+      </w:r>
+      <w:r>
+        <w:rPr>
+          <w:sz w:val="20"/>
+          <w:szCs w:val="20"/>
+          <w:lang w:val="es-CL"/>
+        </w:rPr>
+        <w:t xml:space="preserve">La tabla muestra los seis espacios con su tipo, estado, patente, conductor y tiempo con cobro. Se puede filtrar por libres, ocupados y reservas, y buscar por patente. El mensaje de abajo avisa que se liberó el espacio E-01 y que el cobro quedó registrado en </w:t>
+      </w:r>
+      <w:proofErr w:type="spellStart"/>
+      <w:r>
+        <w:rPr>
+          <w:sz w:val="20"/>
+          <w:szCs w:val="20"/>
+          <w:lang w:val="es-CL"/>
+        </w:rPr>
+        <w:t>Firebase</w:t>
+      </w:r>
+      <w:proofErr w:type="spellEnd"/>
+      <w:r>
+        <w:rPr>
+          <w:sz w:val="20"/>
+          <w:szCs w:val="20"/>
+          <w:lang w:val="es-CL"/>
+        </w:rPr>
+        <w:t xml:space="preserve"> </w:t>
+      </w:r>
+      <w:proofErr w:type="spellStart"/>
+      <w:r>
+        <w:rPr>
+          <w:sz w:val="20"/>
+          <w:szCs w:val="20"/>
+          <w:lang w:val="es-CL"/>
+        </w:rPr>
+        <w:t>Firestore</w:t>
+      </w:r>
+      <w:proofErr w:type="spellEnd"/>
+      <w:r>
+        <w:rPr>
+          <w:sz w:val="20"/>
+          <w:szCs w:val="20"/>
+          <w:lang w:val="es-CL"/>
+        </w:rPr>
+        <w:t>.</w:t>
       </w:r>
     </w:p>
     <w:p>
@@ -1132,17 +1158,13 @@
         <w:keepNext/>
         <w:spacing w:before="120" w:after="60"/>
         <w:jc w:val="center"/>
-        <w:rPr>
-          <w:u w:val="single"/>
-          <w:lang w:val="es-MX"/>
-        </w:rPr>
       </w:pPr>
       <w:r>
         <w:rPr>
           <w:noProof/>
         </w:rPr>
         <w:drawing>
-          <wp:inline distT="0" distB="0" distL="0" distR="0" wp14:anchorId="2FBBD1B6" wp14:editId="75EB729B">
+          <wp:inline distT="0" distB="0" distL="0" distR="0" wp14:anchorId="2FBBD1B6" wp14:editId="53690816">
             <wp:extent cx="4191000" cy="2847975"/>
             <wp:effectExtent l="0" t="0" r="0" b="0"/>
             <wp:docPr id="8" name="crear.png" descr="crear.png" title="crear.png"/>
@@ -1616,7 +1638,7 @@
     </w:p>
     <w:p>
       <w:pPr>
-        <w:pStyle w:val="Ttulo1"/>
+        <w:pStyle w:val="Heading1"/>
         <w:rPr>
           <w:lang w:val="es-CL"/>
         </w:rPr>
@@ -1659,7 +1681,7 @@
       <w:hyperlink r:id="rId20" w:history="1">
         <w:r>
           <w:rPr>
-            <w:rStyle w:val="Hipervnculo"/>
+            <w:rStyle w:val="Hyperlink"/>
             <w:lang w:val="es-CL"/>
           </w:rPr>
           <w:t>https://github.com/PaulFL808/INTELIGEMENTE-ESTACIONADO</w:t>
@@ -1676,7 +1698,7 @@
       <w:hyperlink r:id="rId21" w:history="1">
         <w:r>
           <w:rPr>
-            <w:rStyle w:val="Hipervnculo"/>
+            <w:rStyle w:val="Hyperlink"/>
           </w:rPr>
           <w:t>http://puntoalerce.chilecentral.cloudapp.azure.com</w:t>
         </w:r>
@@ -1981,7 +2003,7 @@
     </w:p>
     <w:p>
       <w:pPr>
-        <w:pStyle w:val="Ttulo1"/>
+        <w:pStyle w:val="Heading1"/>
         <w:rPr>
           <w:lang w:val="es-CL"/>
         </w:rPr>
@@ -2613,7 +2635,7 @@
     <w:name w:val="Normal"/>
     <w:qFormat/>
   </w:style>
-  <w:style w:type="paragraph" w:styleId="Ttulo1">
+  <w:style w:type="paragraph" w:styleId="Heading1">
     <w:name w:val="heading 1"/>
     <w:basedOn w:val="Normal"/>
     <w:next w:val="Normal"/>
@@ -2632,7 +2654,7 @@
       <w:szCs w:val="28"/>
     </w:rPr>
   </w:style>
-  <w:style w:type="paragraph" w:styleId="Ttulo2">
+  <w:style w:type="paragraph" w:styleId="Heading2">
     <w:name w:val="heading 2"/>
     <w:basedOn w:val="Normal"/>
     <w:next w:val="Normal"/>
@@ -2649,7 +2671,7 @@
       <w:szCs w:val="26"/>
     </w:rPr>
   </w:style>
-  <w:style w:type="paragraph" w:styleId="Ttulo3">
+  <w:style w:type="paragraph" w:styleId="Heading3">
     <w:name w:val="heading 3"/>
     <w:basedOn w:val="Normal"/>
     <w:next w:val="Normal"/>
@@ -2666,7 +2688,7 @@
       <w:szCs w:val="24"/>
     </w:rPr>
   </w:style>
-  <w:style w:type="paragraph" w:styleId="Ttulo4">
+  <w:style w:type="paragraph" w:styleId="Heading4">
     <w:name w:val="heading 4"/>
     <w:basedOn w:val="Normal"/>
     <w:next w:val="Normal"/>
@@ -2683,7 +2705,7 @@
       <w:color w:val="2E74B5"/>
     </w:rPr>
   </w:style>
-  <w:style w:type="paragraph" w:styleId="Ttulo5">
+  <w:style w:type="paragraph" w:styleId="Heading5">
     <w:name w:val="heading 5"/>
     <w:basedOn w:val="Normal"/>
     <w:next w:val="Normal"/>
@@ -2698,7 +2720,7 @@
       <w:color w:val="2E74B5"/>
     </w:rPr>
   </w:style>
-  <w:style w:type="paragraph" w:styleId="Ttulo6">
+  <w:style w:type="paragraph" w:styleId="Heading6">
     <w:name w:val="heading 6"/>
     <w:basedOn w:val="Normal"/>
     <w:next w:val="Normal"/>
@@ -2713,12 +2735,12 @@
       <w:color w:val="1F4D78"/>
     </w:rPr>
   </w:style>
-  <w:style w:type="character" w:default="1" w:styleId="Fuentedeprrafopredeter">
+  <w:style w:type="character" w:default="1" w:styleId="DefaultParagraphFont">
     <w:name w:val="Default Paragraph Font"/>
     <w:uiPriority w:val="1"/>
     <w:unhideWhenUsed/>
   </w:style>
-  <w:style w:type="table" w:default="1" w:styleId="Tablanormal">
+  <w:style w:type="table" w:default="1" w:styleId="TableNormal">
     <w:name w:val="Normal Table"/>
     <w:uiPriority w:val="99"/>
     <w:semiHidden/>
@@ -2733,13 +2755,13 @@
       </w:tblCellMar>
     </w:tblPr>
   </w:style>
-  <w:style w:type="numbering" w:default="1" w:styleId="Sinlista">
+  <w:style w:type="numbering" w:default="1" w:styleId="NoList">
     <w:name w:val="No List"/>
     <w:uiPriority w:val="99"/>
     <w:semiHidden/>
     <w:unhideWhenUsed/>
   </w:style>
-  <w:style w:type="paragraph" w:styleId="Ttulo">
+  <w:style w:type="paragraph" w:styleId="Title">
     <w:name w:val="Title"/>
     <w:basedOn w:val="Normal"/>
     <w:next w:val="Normal"/>
@@ -2760,12 +2782,12 @@
       <w:bCs/>
     </w:rPr>
   </w:style>
-  <w:style w:type="paragraph" w:styleId="Prrafodelista">
+  <w:style w:type="paragraph" w:styleId="ListParagraph">
     <w:name w:val="List Paragraph"/>
     <w:basedOn w:val="Normal"/>
     <w:qFormat/>
   </w:style>
-  <w:style w:type="character" w:styleId="Hipervnculo">
+  <w:style w:type="character" w:styleId="Hyperlink">
     <w:name w:val="Hyperlink"/>
     <w:uiPriority w:val="99"/>
     <w:unhideWhenUsed/>
@@ -2774,7 +2796,7 @@
       <w:u w:val="single"/>
     </w:rPr>
   </w:style>
-  <w:style w:type="character" w:styleId="Refdenotaalpie">
+  <w:style w:type="character" w:styleId="FootnoteReference">
     <w:name w:val="footnote reference"/>
     <w:uiPriority w:val="99"/>
     <w:semiHidden/>
@@ -2783,10 +2805,10 @@
       <w:vertAlign w:val="superscript"/>
     </w:rPr>
   </w:style>
-  <w:style w:type="paragraph" w:styleId="Textonotapie">
+  <w:style w:type="paragraph" w:styleId="FootnoteText">
     <w:name w:val="footnote text"/>
     <w:basedOn w:val="Normal"/>
-    <w:link w:val="TextonotapieCar"/>
+    <w:link w:val="FootnoteTextChar"/>
     <w:uiPriority w:val="99"/>
     <w:semiHidden/>
     <w:unhideWhenUsed/>
@@ -2795,9 +2817,9 @@
       <w:szCs w:val="20"/>
     </w:rPr>
   </w:style>
-  <w:style w:type="character" w:customStyle="1" w:styleId="TextonotapieCar">
-    <w:name w:val="Texto nota pie Car"/>
-    <w:link w:val="Textonotapie"/>
+  <w:style w:type="character" w:customStyle="1" w:styleId="FootnoteTextChar">
+    <w:name w:val="Footnote Text Char"/>
+    <w:link w:val="FootnoteText"/>
     <w:uiPriority w:val="99"/>
     <w:semiHidden/>
     <w:unhideWhenUsed/>
@@ -2806,7 +2828,7 @@
       <w:szCs w:val="20"/>
     </w:rPr>
   </w:style>
-  <w:style w:type="character" w:styleId="Refdenotaalfinal">
+  <w:style w:type="character" w:styleId="EndnoteReference">
     <w:name w:val="endnote reference"/>
     <w:uiPriority w:val="99"/>
     <w:semiHidden/>
@@ -2815,10 +2837,10 @@
       <w:vertAlign w:val="superscript"/>
     </w:rPr>
   </w:style>
-  <w:style w:type="paragraph" w:styleId="Textonotaalfinal">
+  <w:style w:type="paragraph" w:styleId="EndnoteText">
     <w:name w:val="endnote text"/>
     <w:basedOn w:val="Normal"/>
-    <w:link w:val="TextonotaalfinalCar"/>
+    <w:link w:val="EndnoteTextChar"/>
     <w:uiPriority w:val="99"/>
     <w:semiHidden/>
     <w:unhideWhenUsed/>
@@ -2827,9 +2849,9 @@
       <w:szCs w:val="20"/>
     </w:rPr>
   </w:style>
-  <w:style w:type="character" w:customStyle="1" w:styleId="TextonotaalfinalCar">
-    <w:name w:val="Texto nota al final Car"/>
-    <w:link w:val="Textonotaalfinal"/>
+  <w:style w:type="character" w:customStyle="1" w:styleId="EndnoteTextChar">
+    <w:name w:val="Endnote Text Char"/>
+    <w:link w:val="EndnoteText"/>
     <w:uiPriority w:val="99"/>
     <w:semiHidden/>
     <w:unhideWhenUsed/>
@@ -2838,9 +2860,9 @@
       <w:szCs w:val="20"/>
     </w:rPr>
   </w:style>
-  <w:style w:type="character" w:styleId="Mencinsinresolver">
+  <w:style w:type="character" w:styleId="UnresolvedMention">
     <w:name w:val="Unresolved Mention"/>
-    <w:basedOn w:val="Fuentedeprrafopredeter"/>
+    <w:basedOn w:val="DefaultParagraphFont"/>
     <w:uiPriority w:val="99"/>
     <w:semiHidden/>
     <w:unhideWhenUsed/>

</xml_diff>